<commit_message>
Shorten Sinopec cover letter for email; Word only
Co-Authored-By: Claude Opus 5.5 <noreply@anthropic.com>
Claude-Session: https://claude.ai/code/session_01PnX3pAGcPHzZvhM26FVbkQ
</commit_message>
<xml_diff>
--- a/Joseph_Arun_Miranda_Seismic_Project_HSE_Advisor_CoverLetter.docx
+++ b/Joseph_Arun_Miranda_Seismic_Project_HSE_Advisor_CoverLetter.docx
@@ -4,79 +4,19 @@
   <w:body>
     <w:p>
       <w:pPr>
-        <w:spacing w:after="20"/>
-      </w:pPr>
-      <w:r>
-        <w:rPr>
-          <w:b/>
-          <w:color w:val="1F3A5F"/>
-          <w:sz w:val="32"/>
-        </w:rPr>
-        <w:t>JOSEPH AROCKIA ARUN LOUIS MIRANDA</w:t>
-      </w:r>
-    </w:p>
-    <w:p>
-      <w:pPr>
-        <w:spacing w:after="20"/>
-      </w:pPr>
-      <w:r>
-        <w:rPr>
-          <w:b/>
-          <w:sz w:val="21"/>
-        </w:rPr>
-        <w:t>Senior HSE Advisor | QHSE Field Operations | NEBOSH IGC</w:t>
-      </w:r>
-    </w:p>
-    <w:p>
-      <w:pPr>
-        <w:spacing w:after="200"/>
-        <w:pBdr>
-          <w:bottom w:val="single" w:sz="8" w:space="4" w:color="1F3A5F"/>
-        </w:pBdr>
-      </w:pPr>
-      <w:r>
-        <w:rPr>
-          <w:b w:val="0"/>
-          <w:sz w:val="20"/>
-        </w:rPr>
-        <w:t>+91 77086 52155 | +993 63 997189 | arunmiranda@gmail.com | Turkmenistan</w:t>
-      </w:r>
-    </w:p>
-    <w:p>
-      <w:pPr>
-        <w:spacing w:after="160"/>
-      </w:pPr>
-      <w:r>
-        <w:rPr>
-          <w:b w:val="0"/>
-        </w:rPr>
-        <w:t>24 October 2026</w:t>
-      </w:r>
-    </w:p>
-    <w:p>
-      <w:pPr>
-        <w:spacing w:after="160"/>
-      </w:pPr>
-      <w:r>
-        <w:rPr>
-          <w:b w:val="0"/>
-        </w:rPr>
-        <w:t>Recruitment Team</w:t>
-        <w:br/>
-        <w:t>Sinopec – Seismic Project</w:t>
-        <w:br/>
-        <w:t>Saudi Arabia</w:t>
-      </w:r>
-    </w:p>
-    <w:p>
-      <w:pPr>
-        <w:spacing w:after="160"/>
+        <w:spacing w:after="280"/>
       </w:pPr>
       <w:r>
         <w:rPr>
           <w:b/>
         </w:rPr>
-        <w:t>Subject: Application for Seismic Project HSE Advisor – Field-Based, Saudi Arabia</w:t>
+        <w:t xml:space="preserve">Subject: </w:t>
+      </w:r>
+      <w:r>
+        <w:rPr>
+          <w:b w:val="0"/>
+        </w:rPr>
+        <w:t>Application – Seismic Project HSE Advisor (Field-Based, Saudi Arabia) – Joseph Arockia Arun Louis Miranda</w:t>
       </w:r>
     </w:p>
     <w:p>
@@ -88,69 +28,183 @@
       </w:r>
     </w:p>
     <w:p>
+      <w:r>
+        <w:rPr>
+          <w:b w:val="0"/>
+        </w:rPr>
+        <w:t xml:space="preserve">I am applying for the </w:t>
+      </w:r>
+      <w:r>
+        <w:rPr>
+          <w:b/>
+        </w:rPr>
+        <w:t>Seismic Project HSE Advisor</w:t>
+      </w:r>
+      <w:r>
+        <w:rPr>
+          <w:b w:val="0"/>
+        </w:rPr>
+        <w:t xml:space="preserve"> position. I bring </w:t>
+      </w:r>
+      <w:r>
+        <w:rPr>
+          <w:b/>
+        </w:rPr>
+        <w:t>25+ years of field-based QHSE experience</w:t>
+      </w:r>
+      <w:r>
+        <w:rPr>
+          <w:b w:val="0"/>
+        </w:rPr>
+        <w:t xml:space="preserve"> in oil and gas operations across Oman, Kazakhstan, the UAE and Turkmenistan, and I hold the </w:t>
+      </w:r>
+      <w:r>
+        <w:rPr>
+          <w:b/>
+        </w:rPr>
+        <w:t>NEBOSH IGC</w:t>
+      </w:r>
+      <w:r>
+        <w:rPr>
+          <w:b w:val="0"/>
+        </w:rPr>
+        <w:t xml:space="preserve"> certification.</w:t>
+      </w:r>
+    </w:p>
+    <w:p>
       <w:pPr>
-        <w:jc w:val="both"/>
+        <w:spacing w:after="80"/>
+      </w:pPr>
+      <w:r>
+        <w:rPr>
+          <w:b/>
+        </w:rPr>
+        <w:t>What I offer:</w:t>
+      </w:r>
+    </w:p>
+    <w:p>
+      <w:pPr>
+        <w:spacing w:after="60"/>
+        <w:ind w:left="288" w:hanging="216"/>
       </w:pPr>
       <w:r>
         <w:rPr>
           <w:b w:val="0"/>
         </w:rPr>
-        <w:t>I am writing to apply for the position of Seismic Project HSE Advisor. I am a NEBOSH IGC-certified HSE professional with over 25 years of field-based QHSE experience in oil and gas, gas processing and pipeline projects across Oman, Kazakhstan, the UAE, Qatar and Turkmenistan. I would welcome the opportunity to support your field operations in Saudi Arabia.</w:t>
+        <w:t xml:space="preserve">•  </w:t>
+      </w:r>
+      <w:r>
+        <w:rPr>
+          <w:b/>
+        </w:rPr>
+        <w:t xml:space="preserve">Incident investigations: </w:t>
+      </w:r>
+      <w:r>
+        <w:rPr>
+          <w:b w:val="0"/>
+        </w:rPr>
+        <w:t>led investigations using root cause analysis (RCA) and supported ICAM investigations, achieving 98% corrective-action closure on Tengizchevroil (Chevron) projects.</w:t>
       </w:r>
     </w:p>
     <w:p>
       <w:pPr>
-        <w:jc w:val="both"/>
+        <w:spacing w:after="60"/>
+        <w:ind w:left="288" w:hanging="216"/>
       </w:pPr>
       <w:r>
         <w:rPr>
           <w:b w:val="0"/>
         </w:rPr>
-        <w:t>Your advertisement emphasises incident investigation, field inspections and corrective action follow-up, which have been central to my career. As Project HSE Manager on Tengizchevroil's Future Growth Projects, I investigated incidents using root cause analysis and achieved a 98% corrective-action closure rate across a 5,000+ workforce. In my current role with Petrofac on the Galkynysh Gas Field O&amp;M Project, I perform field HSE audits, evaluate high-risk tasks, guide HAZID and JSA risk assessments, and support ICAM-based investigations.</w:t>
+        <w:t xml:space="preserve">•  </w:t>
+      </w:r>
+      <w:r>
+        <w:rPr>
+          <w:b/>
+        </w:rPr>
+        <w:t xml:space="preserve">Field safety inspections, risk assessments and hazard identification: </w:t>
+      </w:r>
+      <w:r>
+        <w:rPr>
+          <w:b w:val="0"/>
+        </w:rPr>
+        <w:t>HAZID and JSA for high-risk field activities, and identification of unsafe practices.</w:t>
       </w:r>
     </w:p>
     <w:p>
       <w:pPr>
-        <w:jc w:val="both"/>
+        <w:spacing w:after="60"/>
+        <w:ind w:left="288" w:hanging="216"/>
       </w:pPr>
       <w:r>
         <w:rPr>
           <w:b w:val="0"/>
         </w:rPr>
-        <w:t>I also have extensive experience identifying unsafe practices and turning them into practical QHSE awareness and training. I have delivered safety inductions for new hires and subcontractors, hands-on training for high-risk activities, and safety leadership training for more than 200 supervisors. As a certified Competence Assessor, I assess competence after training through practical observation in the field.</w:t>
+        <w:t xml:space="preserve">•  </w:t>
+      </w:r>
+      <w:r>
+        <w:rPr>
+          <w:b/>
+        </w:rPr>
+        <w:t xml:space="preserve">QHSE awareness and training: </w:t>
+      </w:r>
+      <w:r>
+        <w:rPr>
+          <w:b w:val="0"/>
+        </w:rPr>
+        <w:t>safety inductions, hands-on training, and safety leadership training for 200+ supervisors; certified Competence Assessor.</w:t>
       </w:r>
     </w:p>
     <w:p>
       <w:pPr>
-        <w:jc w:val="both"/>
+        <w:spacing w:after="60"/>
+        <w:ind w:left="288" w:hanging="216"/>
       </w:pPr>
       <w:r>
         <w:rPr>
           <w:b w:val="0"/>
         </w:rPr>
-        <w:t>Much of my career has been spent as a contractor HSE lead on operator-led projects for PDO, Tengizchevroil and CPC. This involved working within client HSE systems, such as Chevron OEMS, and closing out corrective actions. These projects achieved milestones such as 8 million man-hours without LTI on the PDO Nimr-G and Karim West projects.</w:t>
+        <w:t xml:space="preserve">•  </w:t>
+      </w:r>
+      <w:r>
+        <w:rPr>
+          <w:b/>
+        </w:rPr>
+        <w:t xml:space="preserve">Client coordination: </w:t>
+      </w:r>
+      <w:r>
+        <w:rPr>
+          <w:b w:val="0"/>
+        </w:rPr>
+        <w:t>contractor HSE lead on operator projects for PDO, Tengizchevroil and CPC, including HSE audits and corrective-action follow-up.</w:t>
       </w:r>
     </w:p>
     <w:p>
       <w:pPr>
-        <w:jc w:val="both"/>
+        <w:spacing w:after="0"/>
       </w:pPr>
       <w:r>
         <w:rPr>
           <w:b w:val="0"/>
         </w:rPr>
-        <w:t>I would value the opportunity to discuss how my field experience can contribute to safe, compliant seismic operations. Thank you for considering my application; my CV is attached for your review.</w:t>
+      </w:r>
+    </w:p>
+    <w:p>
+      <w:r>
+        <w:rPr>
+          <w:b w:val="0"/>
+        </w:rPr>
+        <w:t>My CV is attached. I am available for an interview at your convenience and can be reached at +91 77086 52155 / +993 63 997189 or arunmiranda@gmail.com.</w:t>
       </w:r>
     </w:p>
     <w:p>
       <w:pPr>
-        <w:spacing w:after="360"/>
+        <w:spacing w:after="40"/>
       </w:pPr>
       <w:r>
         <w:rPr>
           <w:b w:val="0"/>
         </w:rPr>
-        <w:t>Yours sincerely,</w:t>
+        <w:t>Kind regards,</w:t>
       </w:r>
     </w:p>
     <w:p>
@@ -164,9 +218,20 @@
         <w:t>Joseph Arockia Arun Louis Miranda</w:t>
       </w:r>
     </w:p>
+    <w:p>
+      <w:pPr>
+        <w:spacing w:after="0"/>
+      </w:pPr>
+      <w:r>
+        <w:rPr>
+          <w:b w:val="0"/>
+        </w:rPr>
+        <w:t>Senior HSE Advisor | NEBOSH IGC | PDO Approved HSE Advisor</w:t>
+      </w:r>
+    </w:p>
     <w:sectPr>
       <w:pgSz w:w="11909" w:h="16834"/>
-      <w:pgMar w:top="1152" w:right="1440" w:bottom="1152" w:left="1440" w:header="720" w:footer="720" w:gutter="0"/>
+      <w:pgMar w:top="1440" w:right="1440" w:bottom="1440" w:left="1440" w:header="720" w:footer="720" w:gutter="0"/>
       <w:cols w:space="720"/>
       <w:docGrid w:linePitch="360"/>
     </w:sectPr>
@@ -538,7 +603,7 @@
     <w:qFormat/>
     <w:rsid w:val="00FC693F"/>
     <w:pPr>
-      <w:spacing w:after="160" w:line="269" w:lineRule="auto"/>
+      <w:spacing w:after="160" w:line="264" w:lineRule="auto"/>
     </w:pPr>
     <w:rPr>
       <w:rFonts w:ascii="Calibri" w:hAnsi="Calibri" w:eastAsia="Calibri"/>

</xml_diff>